<commit_message>
Publish approved public CV and refresh view/download links
</commit_message>
<xml_diff>
--- a/downloads/Guramrit_Grewal_CV_Public.docx
+++ b/downloads/Guramrit_Grewal_CV_Public.docx
@@ -4,83 +4,80 @@
   <w:body>
     <w:p>
       <w:pPr>
-        <w:pStyle w:val="CVName"/>
+        <w:spacing w:after="0"/>
+        <w:jc w:val="left"/>
       </w:pPr>
       <w:r>
-        <w:t>Guramrit Grewal</w:t>
+        <w:rPr>
+          <w:rFonts w:ascii="Calibri" w:hAnsi="Calibri"/>
+          <w:b/>
+          <w:color w:val="193549"/>
+          <w:sz w:val="41"/>
+        </w:rPr>
+        <w:t>GURAMRIT GREWAL</w:t>
       </w:r>
     </w:p>
     <w:p>
       <w:pPr>
-        <w:pStyle w:val="CVContact"/>
+        <w:spacing w:after="80"/>
       </w:pPr>
       <w:r>
-        <w:t>Wolverhampton, UK</w:t>
+        <w:rPr>
+          <w:b/>
+          <w:color w:val="22707C"/>
+          <w:sz w:val="20"/>
+        </w:rPr>
+        <w:t>COMMERCIAL EXPERIENCE  /  PROCUREMENT  /  ANALYTICAL PROJECTS</w:t>
       </w:r>
     </w:p>
     <w:p>
       <w:pPr>
-        <w:pStyle w:val="CVContact"/>
+        <w:pStyle w:val="CVCompact"/>
+        <w:spacing w:after="120"/>
       </w:pPr>
       <w:r>
-        <w:t xml:space="preserve">Portfolio  </w:t>
-      </w:r>
-      <w:hyperlink r:id="rId9">
-        <w:r>
-          <w:rPr>
-            <w:color w:val="1C5C86"/>
-            <w:u w:val="single"/>
-            <w:sz w:val="23"/>
-          </w:rPr>
-          <w:t>g-grewal-98.github.io</w:t>
-        </w:r>
-      </w:hyperlink>
-    </w:p>
-    <w:p>
-      <w:pPr>
-        <w:pStyle w:val="SectionLabel"/>
-        <w:pBdr>
-          <w:bottom w:val="single" w:sz="9" w:color="CBD7DE"/>
-        </w:pBdr>
-      </w:pPr>
-      <w:r>
-        <w:t>PROFESSIONAL PROFILE</w:t>
+        <w:rPr>
+          <w:color w:val="404F57"/>
+          <w:sz w:val="20"/>
+        </w:rPr>
+        <w:t>Wolverhampton, UK  |  g-grewal-98.github.io</w:t>
       </w:r>
     </w:p>
     <w:p>
       <w:pPr>
-        <w:pStyle w:val="ProfileText"/>
+        <w:pStyle w:val="CVSection"/>
       </w:pPr>
       <w:r>
-        <w:t>Retail professional and science graduate with seven years of experience in supplier coordination, purchasing support, customer service and stock monitoring. Developed an Excel purchasing tool and an independent Python, SQLite and Power BI procurement analytics portfolio, demonstrating structured product comparisons and evidence-based reporting. Interested in procurement, commercial operations and junior analytics opportunities.</w:t>
+        <w:t>PROFILE</w:t>
       </w:r>
     </w:p>
     <w:p>
       <w:pPr>
-        <w:pStyle w:val="SectionLabel"/>
-        <w:pBdr>
-          <w:bottom w:val="single" w:sz="9" w:color="CBD7DE"/>
-        </w:pBdr>
+        <w:pStyle w:val="CVCompact"/>
       </w:pPr>
       <w:r>
-        <w:t>CORE STRENGTHS</w:t>
+        <w:t>Science graduate with seven years’ retail experience involving product sourcing, buying recommendations, pricing and customer relationships. Introduced a new retail product category and built analytical tools to support purchasing decisions, combining commercial judgement with Excel, SQL, Python and Power BI.</w:t>
       </w:r>
     </w:p>
     <w:p>
       <w:pPr>
-        <w:pStyle w:val="SkillStrip"/>
+        <w:pStyle w:val="CVSection"/>
       </w:pPr>
       <w:r>
-        <w:t>Purchasing support  •  Supplier communications  •  Excel  •  SQL  •  Power BI  •  Commercial reporting  •  Data quality</w:t>
+        <w:t>RELEVANT STRENGTHS</w:t>
       </w:r>
     </w:p>
     <w:p>
       <w:pPr>
-        <w:pStyle w:val="SectionLabel"/>
-        <w:keepNext/>
-        <w:pBdr>
-          <w:bottom w:val="single" w:sz="9" w:color="CBD7DE"/>
-        </w:pBdr>
+        <w:pStyle w:val="CVCompact"/>
+      </w:pPr>
+      <w:r>
+        <w:t>Product selection  •  Supplier negotiation  •  Commercial analysis  •  Power BI  •  SQL  •  Excel</w:t>
+      </w:r>
+    </w:p>
+    <w:p>
+      <w:pPr>
+        <w:pStyle w:val="CVSection"/>
       </w:pPr>
       <w:r>
         <w:t>PROFESSIONAL EXPERIENCE</w:t>
@@ -88,232 +85,105 @@
     </w:p>
     <w:p>
       <w:pPr>
-        <w:pStyle w:val="RoleLine"/>
-        <w:keepNext/>
+        <w:pStyle w:val="CVCompact"/>
       </w:pPr>
       <w:r>
+        <w:rPr>
+          <w:b/>
+        </w:rPr>
         <w:t>Shop Assistant  |  Vino Kinver Convenience Store, Kinver, Stourbridge</w:t>
+      </w:r>
+      <w:r>
+        <w:rPr>
+          <w:i/>
+          <w:sz w:val="20"/>
+        </w:rPr>
+        <w:t xml:space="preserve">    Sep 2019 – Present</w:t>
       </w:r>
     </w:p>
     <w:p>
       <w:pPr>
-        <w:pStyle w:val="RoleDate"/>
-        <w:keepNext/>
+        <w:pStyle w:val="CVBullet"/>
       </w:pPr>
       <w:r>
-        <w:t>September 2019 - present</w:t>
+        <w:t>•  Proposed and helped expand the store’s first trading-card category, influencing the introduction of new product ranges based on expected demand.</w:t>
       </w:r>
     </w:p>
     <w:p>
       <w:pPr>
-        <w:pStyle w:val="BulletText"/>
-        <w:keepNext/>
+        <w:pStyle w:val="CVBullet"/>
       </w:pPr>
       <w:r>
-        <w:t>•  Supported wholesale applications and supplier follow-up, contributing to eight approved accounts and access to additional product ranges.</w:t>
+        <w:t>•  Independently researched products and suppliers, negotiated purchasing terms and made buying recommendations frequently approved by the owner.</w:t>
       </w:r>
     </w:p>
     <w:p>
       <w:pPr>
-        <w:pStyle w:val="BulletText"/>
-        <w:keepNext/>
+        <w:pStyle w:val="CVBullet"/>
       </w:pPr>
       <w:r>
-        <w:t>•  Independently evaluated 60 products for a wholesale application using supplier cost and market-price comparisons.</w:t>
+        <w:t>•  Used supplier quotes, margins, stock movement and customer preferences to recommend prices and replenishment priorities.</w:t>
       </w:r>
     </w:p>
     <w:p>
       <w:pPr>
-        <w:pStyle w:val="BulletText"/>
-        <w:keepNext/>
+        <w:pStyle w:val="CVBullet"/>
       </w:pPr>
       <w:r>
-        <w:t>•  Compared wholesale costs, retail selling prices and purchasing restrictions to support product selection.</w:t>
+        <w:t>•  Assessed future demand and supply constraints when recommending advance purchases, with selected products subsequently sold profitably.</w:t>
       </w:r>
     </w:p>
     <w:p>
       <w:pPr>
-        <w:pStyle w:val="BulletText"/>
-        <w:keepNext/>
+        <w:pStyle w:val="CVBullet"/>
       </w:pPr>
       <w:r>
-        <w:t>•  Monitored inventory and customer demand signals; coordinated supplier enquiries, orders and delivery follow-up.</w:t>
+        <w:t>•  Developed a workplace Excel buying and stock tracker for more than 100 product lines.</w:t>
       </w:r>
     </w:p>
     <w:p>
       <w:pPr>
-        <w:pStyle w:val="BulletText"/>
-        <w:keepNext/>
+        <w:pStyle w:val="CVSection"/>
       </w:pPr>
       <w:r>
-        <w:t>•  Provided customer service, product recommendations and operational administration.</w:t>
+        <w:t>APPLIED PROJECT  |  PROCUREMENT ANALYTICS, 2026</w:t>
       </w:r>
     </w:p>
     <w:p>
       <w:pPr>
-        <w:pStyle w:val="RoleLine"/>
-        <w:keepNext/>
+        <w:pStyle w:val="CVBullet"/>
       </w:pPr>
       <w:r>
-        <w:t>Workplace project  |  Excel purchasing and inventory tool</w:t>
+        <w:t>•  Developed Python, SQLite and Power BI tools to assess supplier offers, pricing evidence and buying scenarios; used analytical outputs to inform real purchasing recommendations.</w:t>
       </w:r>
     </w:p>
     <w:p>
       <w:pPr>
-        <w:pStyle w:val="BulletText"/>
+        <w:pStyle w:val="CVBullet"/>
       </w:pPr>
       <w:r>
-        <w:t>•  Built an Excel tool covering 100+ products to compare purchase costs, selling prices, margins and demand, including stock-cover and reorder calculations.</w:t>
+        <w:t>•  Public code and interactive demonstrations use fictional product data, avoiding exposure of supplier quotations and private shop records.</w:t>
       </w:r>
     </w:p>
     <w:p>
       <w:pPr>
-        <w:pStyle w:val="SectionLabel"/>
-        <w:keepNext/>
-        <w:pBdr>
-          <w:bottom w:val="single" w:sz="9" w:color="CBD7DE"/>
-        </w:pBdr>
+        <w:pStyle w:val="CVSection"/>
       </w:pPr>
       <w:r>
-        <w:t>INDEPENDENT PROCUREMENT ANALYTICS PORTFOLIO</w:t>
+        <w:t>TECHNICAL &amp; TRANSFERABLE SKILLS</w:t>
       </w:r>
     </w:p>
     <w:p>
       <w:pPr>
-        <w:pStyle w:val="RoleDate"/>
-        <w:keepNext/>
+        <w:pStyle w:val="CVCompact"/>
       </w:pPr>
       <w:r>
-        <w:t>Python  |  SQLite / SQL  |  Power BI / DAX  |  2026</w:t>
+        <w:t>Excel pricing models  •  SQL/SQLite  •  Python data processing  •  Power Query and Power BI/DAX  •  Customer and supplier communication</w:t>
       </w:r>
     </w:p>
     <w:p>
       <w:pPr>
-        <w:pStyle w:val="BulletText"/>
-        <w:keepNext/>
-      </w:pPr>
-      <w:r>
-        <w:t>•  Built an auditable Python and SQLite procurement analytics workflow covering product, supplier, listing and pricing records.</w:t>
-      </w:r>
-    </w:p>
-    <w:p>
-      <w:pPr>
-        <w:pStyle w:val="BulletText"/>
-        <w:keepNext/>
-      </w:pPr>
-      <w:r>
-        <w:t>•  Reconciled a mixed historical and synthetic demonstration dataset of 251 offers, 246 products and 395 retail observations.</w:t>
-      </w:r>
-    </w:p>
-    <w:p>
-      <w:pPr>
-        <w:pStyle w:val="BulletText"/>
-      </w:pPr>
-      <w:r>
-        <w:t>•  Tested evidence quality, variant matching, missing identifiers, VAT-aware margins, MOQ and bulk quantity scenarios.</w:t>
-      </w:r>
-    </w:p>
-    <w:p>
-      <w:pPr>
-        <w:pStyle w:val="BulletText"/>
-      </w:pPr>
-      <w:r>
-        <w:t>•  Added Power Query and DAX reporting to Power BI; the project reported 30 native DAX checks and 56 regression tests passing.</w:t>
-      </w:r>
-    </w:p>
-    <w:p>
-      <w:pPr>
-        <w:pStyle w:val="BulletText"/>
-      </w:pPr>
-      <w:r>
-        <w:t>•  Maintained a public-safe fictional demonstration separate from private commercial records and live supplier quotations.</w:t>
-      </w:r>
-    </w:p>
-    <w:p>
-      <w:pPr>
-        <w:pStyle w:val="Disclosure"/>
-      </w:pPr>
-      <w:r>
-        <w:t>Project results are from historical and synthetic test data; not evidence of live automated purchasing or realised business savings.</w:t>
-      </w:r>
-    </w:p>
-    <w:p>
-      <w:pPr>
-        <w:pStyle w:val="SectionLabel"/>
-        <w:pBdr>
-          <w:bottom w:val="single" w:sz="9" w:color="CBD7DE"/>
-        </w:pBdr>
-      </w:pPr>
-      <w:r>
-        <w:t>TECHNICAL AND COMMERCIAL SKILLS</w:t>
-      </w:r>
-    </w:p>
-    <w:p>
-      <w:pPr>
-        <w:pStyle w:val="DetailText"/>
-      </w:pPr>
-      <w:r>
-        <w:rPr>
-          <w:b/>
-          <w:color w:val="1F3B53"/>
-        </w:rPr>
-        <w:t xml:space="preserve">Excel:  </w:t>
-      </w:r>
-      <w:r>
-        <w:t>PivotTables, XLOOKUP, SUMIFS, COUNTIFS, pricing and inventory analysis.</w:t>
-      </w:r>
-    </w:p>
-    <w:p>
-      <w:pPr>
-        <w:pStyle w:val="DetailText"/>
-      </w:pPr>
-      <w:r>
-        <w:rPr>
-          <w:b/>
-          <w:color w:val="1F3B53"/>
-        </w:rPr>
-        <w:t xml:space="preserve">SQL / Python:  </w:t>
-      </w:r>
-      <w:r>
-        <w:t>SQLite models, joins, data imports, validation and repeatable processing.</w:t>
-      </w:r>
-    </w:p>
-    <w:p>
-      <w:pPr>
-        <w:pStyle w:val="DetailText"/>
-      </w:pPr>
-      <w:r>
-        <w:rPr>
-          <w:b/>
-          <w:color w:val="1F3B53"/>
-        </w:rPr>
-        <w:t xml:space="preserve">Power BI:  </w:t>
-      </w:r>
-      <w:r>
-        <w:t>Power Query, DAX, supplier/evidence reports, KPI measures and interactive filtering.</w:t>
-      </w:r>
-    </w:p>
-    <w:p>
-      <w:pPr>
-        <w:pStyle w:val="DetailText"/>
-      </w:pPr>
-      <w:r>
-        <w:rPr>
-          <w:b/>
-          <w:color w:val="1F3B53"/>
-        </w:rPr>
-        <w:t xml:space="preserve">Business:  </w:t>
-      </w:r>
-      <w:r>
-        <w:t>Supplier communication, product research, order coordination and customer service.</w:t>
-      </w:r>
-    </w:p>
-    <w:p>
-      <w:pPr>
-        <w:pStyle w:val="SectionLabel"/>
-        <w:pBdr>
-          <w:bottom w:val="single" w:sz="9" w:color="CBD7DE"/>
-        </w:pBdr>
+        <w:pStyle w:val="CVSection"/>
       </w:pPr>
       <w:r>
         <w:t>EDUCATION</w:t>
@@ -321,23 +191,15 @@
     </w:p>
     <w:p>
       <w:pPr>
-        <w:pStyle w:val="Degree"/>
+        <w:pStyle w:val="CVCompact"/>
       </w:pPr>
       <w:r>
-        <w:t>BSc (Hons) Bioveterinary Sciences  |  2:1</w:t>
-      </w:r>
-    </w:p>
-    <w:p>
-      <w:pPr>
-        <w:pStyle w:val="DetailText"/>
-      </w:pPr>
-      <w:r>
-        <w:t>Royal Veterinary College, University of London  |  2016-2019</w:t>
+        <w:t>BSc (Hons) Bioveterinary Sciences (2:1)  |  Royal Veterinary College, University of London  |  2019</w:t>
       </w:r>
     </w:p>
     <w:sectPr>
-      <w:pgSz w:w="11906" w:h="16838"/>
-      <w:pgMar w:top="850" w:right="992" w:bottom="850" w:left="992" w:header="397" w:footer="397" w:gutter="0"/>
+      <w:pgSz w:w="11909" w:h="16834"/>
+      <w:pgMar w:top="907" w:right="1080" w:bottom="821" w:left="1080" w:header="720" w:footer="720" w:gutter="0"/>
       <w:cols w:space="720"/>
       <w:docGrid w:linePitch="360"/>
     </w:sectPr>
@@ -709,12 +571,12 @@
     <w:qFormat/>
     <w:rsid w:val="00FC693F"/>
     <w:pPr>
-      <w:spacing w:after="80" w:line="286" w:lineRule="auto"/>
+      <w:spacing w:after="0" w:line="271" w:lineRule="auto"/>
     </w:pPr>
     <w:rPr>
-      <w:rFonts w:ascii="Carlito" w:hAnsi="Carlito"/>
-      <w:color w:val="1E2B36"/>
-      <w:sz w:val="25"/>
+      <w:rFonts w:ascii="Calibri" w:hAnsi="Calibri"/>
+      <w:color w:val="193549"/>
+      <w:sz w:val="22"/>
     </w:rPr>
   </w:style>
   <w:style w:type="paragraph" w:styleId="Header">
@@ -12399,159 +12261,40 @@
       </w:tcPr>
     </w:tblStylePr>
   </w:style>
-  <w:style w:type="paragraph" w:customStyle="1" w:styleId="CVName">
-    <w:name w:val="CVName"/>
-    <w:basedOn w:val="Normal"/>
+  <w:style w:type="paragraph" w:customStyle="1" w:styleId="CVSection">
+    <w:name w:val="CV Section"/>
     <w:pPr>
       <w:keepNext/>
-      <w:spacing w:before="0" w:after="80" w:line="240" w:lineRule="auto"/>
+      <w:spacing w:before="190" w:after="68"/>
     </w:pPr>
     <w:rPr>
-      <w:rFonts w:ascii="Carlito" w:hAnsi="Carlito"/>
+      <w:rFonts w:ascii="Calibri" w:hAnsi="Calibri"/>
       <w:b/>
-      <w:color w:val="1F3B53"/>
-      <w:sz w:val="48"/>
-    </w:rPr>
-  </w:style>
-  <w:style w:type="paragraph" w:customStyle="1" w:styleId="CVContact">
-    <w:name w:val="CVContact"/>
-    <w:basedOn w:val="Normal"/>
-    <w:pPr>
-      <w:keepNext/>
-      <w:spacing w:before="0" w:after="30" w:line="259" w:lineRule="auto"/>
-    </w:pPr>
-    <w:rPr>
-      <w:rFonts w:ascii="Carlito" w:hAnsi="Carlito"/>
-      <w:b w:val="0"/>
-      <w:color w:val="5B6873"/>
+      <w:color w:val="22707C"/>
       <w:sz w:val="22"/>
     </w:rPr>
   </w:style>
-  <w:style w:type="paragraph" w:customStyle="1" w:styleId="SectionLabel">
-    <w:name w:val="SectionLabel"/>
-    <w:basedOn w:val="Normal"/>
-    <w:pPr>
-      <w:keepNext/>
-      <w:spacing w:before="260" w:after="140" w:line="264" w:lineRule="auto"/>
+  <w:style w:type="paragraph" w:customStyle="1" w:styleId="CVCompact">
+    <w:name w:val="CV Compact"/>
+    <w:pPr>
+      <w:spacing w:after="52" w:line="269" w:lineRule="auto"/>
     </w:pPr>
     <w:rPr>
-      <w:rFonts w:ascii="Carlito" w:hAnsi="Carlito"/>
-      <w:b/>
-      <w:color w:val="1F3B53"/>
-      <w:sz w:val="25"/>
-    </w:rPr>
-  </w:style>
-  <w:style w:type="paragraph" w:customStyle="1" w:styleId="RoleLine">
-    <w:name w:val="RoleLine"/>
-    <w:basedOn w:val="Normal"/>
-    <w:pPr>
-      <w:keepNext/>
-      <w:spacing w:before="40" w:after="40" w:line="274" w:lineRule="auto"/>
-    </w:pPr>
-    <w:rPr>
-      <w:rFonts w:ascii="Carlito" w:hAnsi="Carlito"/>
-      <w:b/>
-      <w:color w:val="1E2B36"/>
-      <w:sz w:val="24"/>
-    </w:rPr>
-  </w:style>
-  <w:style w:type="paragraph" w:customStyle="1" w:styleId="RoleDate">
-    <w:name w:val="RoleDate"/>
-    <w:basedOn w:val="Normal"/>
-    <w:pPr>
-      <w:keepNext/>
-      <w:spacing w:before="0" w:after="80" w:line="264" w:lineRule="auto"/>
-    </w:pPr>
-    <w:rPr>
-      <w:rFonts w:ascii="Carlito" w:hAnsi="Carlito"/>
-      <w:b w:val="0"/>
-      <w:color w:val="5B6873"/>
+      <w:rFonts w:ascii="Calibri" w:hAnsi="Calibri"/>
+      <w:color w:val="193549"/>
       <w:sz w:val="22"/>
     </w:rPr>
   </w:style>
-  <w:style w:type="paragraph" w:customStyle="1" w:styleId="BulletText">
-    <w:name w:val="BulletText"/>
-    <w:basedOn w:val="Normal"/>
-    <w:pPr>
-      <w:keepNext w:val="0"/>
-      <w:spacing w:before="0" w:after="110" w:line="286" w:lineRule="auto"/>
-      <w:ind w:left="272" w:hanging="181"/>
+  <w:style w:type="paragraph" w:customStyle="1" w:styleId="CVBullet">
+    <w:name w:val="CV Bullet"/>
+    <w:pPr>
+      <w:spacing w:after="68" w:line="269" w:lineRule="auto"/>
+      <w:ind w:left="216" w:hanging="187"/>
     </w:pPr>
     <w:rPr>
-      <w:rFonts w:ascii="Carlito" w:hAnsi="Carlito"/>
-      <w:b w:val="0"/>
-      <w:color w:val="1E2B36"/>
-      <w:sz w:val="25"/>
-    </w:rPr>
-  </w:style>
-  <w:style w:type="paragraph" w:customStyle="1" w:styleId="DetailText">
-    <w:name w:val="DetailText"/>
-    <w:basedOn w:val="Normal"/>
-    <w:pPr>
-      <w:keepNext w:val="0"/>
-      <w:spacing w:before="0" w:after="90" w:line="286" w:lineRule="auto"/>
-    </w:pPr>
-    <w:rPr>
-      <w:rFonts w:ascii="Carlito" w:hAnsi="Carlito"/>
-      <w:b w:val="0"/>
-      <w:color w:val="1E2B36"/>
-      <w:sz w:val="24"/>
-    </w:rPr>
-  </w:style>
-  <w:style w:type="paragraph" w:customStyle="1" w:styleId="ProfileText">
-    <w:name w:val="ProfileText"/>
-    <w:basedOn w:val="Normal"/>
-    <w:pPr>
-      <w:keepNext w:val="0"/>
-      <w:spacing w:before="0" w:after="120" w:line="293" w:lineRule="auto"/>
-    </w:pPr>
-    <w:rPr>
-      <w:rFonts w:ascii="Carlito" w:hAnsi="Carlito"/>
-      <w:b w:val="0"/>
-      <w:color w:val="1E2B36"/>
-      <w:sz w:val="25"/>
-    </w:rPr>
-  </w:style>
-  <w:style w:type="paragraph" w:customStyle="1" w:styleId="SkillStrip">
-    <w:name w:val="SkillStrip"/>
-    <w:basedOn w:val="Normal"/>
-    <w:pPr>
-      <w:keepNext w:val="0"/>
-      <w:spacing w:before="0" w:after="100" w:line="288" w:lineRule="auto"/>
-    </w:pPr>
-    <w:rPr>
-      <w:rFonts w:ascii="Carlito" w:hAnsi="Carlito"/>
-      <w:b w:val="0"/>
-      <w:color w:val="1F3B53"/>
-      <w:sz w:val="24"/>
-    </w:rPr>
-  </w:style>
-  <w:style w:type="paragraph" w:customStyle="1" w:styleId="Disclosure">
-    <w:name w:val="Disclosure"/>
-    <w:basedOn w:val="Normal"/>
-    <w:pPr>
-      <w:keepNext w:val="0"/>
-      <w:spacing w:before="100" w:after="60" w:line="271" w:lineRule="auto"/>
-    </w:pPr>
-    <w:rPr>
-      <w:rFonts w:ascii="Carlito" w:hAnsi="Carlito"/>
-      <w:b w:val="0"/>
-      <w:color w:val="5B6873"/>
+      <w:rFonts w:ascii="Calibri" w:hAnsi="Calibri"/>
+      <w:color w:val="193549"/>
       <w:sz w:val="22"/>
-    </w:rPr>
-  </w:style>
-  <w:style w:type="paragraph" w:customStyle="1" w:styleId="Degree">
-    <w:name w:val="Degree"/>
-    <w:basedOn w:val="Normal"/>
-    <w:pPr>
-      <w:keepNext/>
-      <w:spacing w:before="0" w:after="40" w:line="264" w:lineRule="auto"/>
-    </w:pPr>
-    <w:rPr>
-      <w:rFonts w:ascii="Carlito" w:hAnsi="Carlito"/>
-      <w:b/>
-      <w:color w:val="1F3B53"/>
-      <w:sz w:val="24"/>
     </w:rPr>
   </w:style>
 </w:styles>

</xml_diff>